<commit_message>
Turned off the frame rate control for lower light levels
</commit_message>
<xml_diff>
--- a/SoccerBot 2026 Schedule and Instructions.docx
+++ b/SoccerBot 2026 Schedule and Instructions.docx
@@ -727,7 +727,21 @@
         <w:rPr>
           <w:color w:val="000000"/>
         </w:rPr>
-        <w:t xml:space="preserve">Connect the Rpi to monitor </w:t>
+        <w:t xml:space="preserve">Connect the </w:t>
+      </w:r>
+      <w:proofErr w:type="spellStart"/>
+      <w:r>
+        <w:rPr>
+          <w:color w:val="000000"/>
+        </w:rPr>
+        <w:t>Rpi</w:t>
+      </w:r>
+      <w:proofErr w:type="spellEnd"/>
+      <w:r>
+        <w:rPr>
+          <w:color w:val="000000"/>
+        </w:rPr>
+        <w:t xml:space="preserve"> to monitor </w:t>
       </w:r>
     </w:p>
     <w:p>
@@ -767,11 +781,19 @@
         </w:pBdr>
         <w:spacing w:after="0"/>
       </w:pPr>
-      <w:r>
-        <w:rPr>
-          <w:color w:val="000000"/>
-        </w:rPr>
-        <w:t xml:space="preserve">Rpi Setup </w:t>
+      <w:proofErr w:type="spellStart"/>
+      <w:r>
+        <w:rPr>
+          <w:color w:val="000000"/>
+        </w:rPr>
+        <w:t>Rpi</w:t>
+      </w:r>
+      <w:proofErr w:type="spellEnd"/>
+      <w:r>
+        <w:rPr>
+          <w:color w:val="000000"/>
+        </w:rPr>
+        <w:t xml:space="preserve"> Setup </w:t>
       </w:r>
     </w:p>
     <w:p>
@@ -872,8 +894,16 @@
         <w:rPr>
           <w:color w:val="000000"/>
         </w:rPr>
-        <w:t>Connect to wifi</w:t>
-      </w:r>
+        <w:t xml:space="preserve">Connect to </w:t>
+      </w:r>
+      <w:proofErr w:type="spellStart"/>
+      <w:r>
+        <w:rPr>
+          <w:color w:val="000000"/>
+        </w:rPr>
+        <w:t>wifi</w:t>
+      </w:r>
+      <w:proofErr w:type="spellEnd"/>
     </w:p>
     <w:p>
       <w:pPr>
@@ -938,7 +968,21 @@
         <w:rPr>
           <w:color w:val="000000"/>
         </w:rPr>
-        <w:t>`sudo apt update</w:t>
+        <w:t>`</w:t>
+      </w:r>
+      <w:proofErr w:type="spellStart"/>
+      <w:r>
+        <w:rPr>
+          <w:color w:val="000000"/>
+        </w:rPr>
+        <w:t>sudo</w:t>
+      </w:r>
+      <w:proofErr w:type="spellEnd"/>
+      <w:r>
+        <w:rPr>
+          <w:color w:val="000000"/>
+        </w:rPr>
+        <w:t xml:space="preserve"> apt update</w:t>
       </w:r>
       <w:r>
         <w:rPr>
@@ -1127,7 +1171,21 @@
         <w:rPr>
           <w:color w:val="000000"/>
         </w:rPr>
-        <w:t>` sudo apt install python3-opencv python3-gpiozero python3-picamera2</w:t>
+        <w:t xml:space="preserve">` </w:t>
+      </w:r>
+      <w:proofErr w:type="spellStart"/>
+      <w:r>
+        <w:rPr>
+          <w:color w:val="000000"/>
+        </w:rPr>
+        <w:t>sudo</w:t>
+      </w:r>
+      <w:proofErr w:type="spellEnd"/>
+      <w:r>
+        <w:rPr>
+          <w:color w:val="000000"/>
+        </w:rPr>
+        <w:t xml:space="preserve"> apt install python3-opencv python3-gpiozero python3-picamera2</w:t>
       </w:r>
       <w:r>
         <w:rPr>
@@ -1227,7 +1285,21 @@
         <w:rPr>
           <w:color w:val="000000"/>
         </w:rPr>
-        <w:t>Test with `rpicam-hello`</w:t>
+        <w:t>Test with `</w:t>
+      </w:r>
+      <w:proofErr w:type="spellStart"/>
+      <w:r>
+        <w:rPr>
+          <w:color w:val="000000"/>
+        </w:rPr>
+        <w:t>rpicam</w:t>
+      </w:r>
+      <w:proofErr w:type="spellEnd"/>
+      <w:r>
+        <w:rPr>
+          <w:color w:val="000000"/>
+        </w:rPr>
+        <w:t>-hello`</w:t>
       </w:r>
     </w:p>
     <w:p>
@@ -1293,7 +1365,21 @@
         <w:rPr>
           <w:color w:val="000000"/>
         </w:rPr>
-        <w:t xml:space="preserve">`sudo git clone </w:t>
+        <w:t>`</w:t>
+      </w:r>
+      <w:proofErr w:type="spellStart"/>
+      <w:r>
+        <w:rPr>
+          <w:color w:val="000000"/>
+        </w:rPr>
+        <w:t>sudo</w:t>
+      </w:r>
+      <w:proofErr w:type="spellEnd"/>
+      <w:r>
+        <w:rPr>
+          <w:color w:val="000000"/>
+        </w:rPr>
+        <w:t xml:space="preserve"> git clone </w:t>
       </w:r>
       <w:hyperlink r:id="rId7" w:history="1">
         <w:r>
@@ -1351,10 +1437,32 @@
         <w:rPr>
           <w:color w:val="000000"/>
         </w:rPr>
-        <w:t xml:space="preserve">`python green_ball_tracker.py` (Reuires </w:t>
-      </w:r>
-      <w:r>
-        <w:t>Step I.d to be complete)</w:t>
+        <w:t>`python green_ball_tracker.py` (</w:t>
+      </w:r>
+      <w:proofErr w:type="spellStart"/>
+      <w:r>
+        <w:rPr>
+          <w:color w:val="000000"/>
+        </w:rPr>
+        <w:t>Reuires</w:t>
+      </w:r>
+      <w:proofErr w:type="spellEnd"/>
+      <w:r>
+        <w:rPr>
+          <w:color w:val="000000"/>
+        </w:rPr>
+        <w:t xml:space="preserve"> </w:t>
+      </w:r>
+      <w:r>
+        <w:t xml:space="preserve">Step </w:t>
+      </w:r>
+      <w:proofErr w:type="spellStart"/>
+      <w:r>
+        <w:t>I.d</w:t>
+      </w:r>
+      <w:proofErr w:type="spellEnd"/>
+      <w:r>
+        <w:t xml:space="preserve"> to be complete)</w:t>
       </w:r>
     </w:p>
     <w:p>
@@ -1398,7 +1506,21 @@
         <w:rPr>
           <w:color w:val="000000"/>
         </w:rPr>
-        <w:t>Learn about HSV values and how opencv tracks colors</w:t>
+        <w:t xml:space="preserve">Learn about HSV values and how </w:t>
+      </w:r>
+      <w:proofErr w:type="spellStart"/>
+      <w:r>
+        <w:rPr>
+          <w:color w:val="000000"/>
+        </w:rPr>
+        <w:t>opencv</w:t>
+      </w:r>
+      <w:proofErr w:type="spellEnd"/>
+      <w:r>
+        <w:rPr>
+          <w:color w:val="000000"/>
+        </w:rPr>
+        <w:t xml:space="preserve"> tracks colors</w:t>
       </w:r>
     </w:p>
     <w:p>
@@ -1464,7 +1586,21 @@
         <w:rPr>
           <w:color w:val="000000"/>
         </w:rPr>
-        <w:t>Fabricate the base (See separate “SoccerBot Assembly” document)</w:t>
+        <w:t>Fabricate the base (See separate “</w:t>
+      </w:r>
+      <w:proofErr w:type="spellStart"/>
+      <w:r>
+        <w:rPr>
+          <w:color w:val="000000"/>
+        </w:rPr>
+        <w:t>SoccerBot</w:t>
+      </w:r>
+      <w:proofErr w:type="spellEnd"/>
+      <w:r>
+        <w:rPr>
+          <w:color w:val="000000"/>
+        </w:rPr>
+        <w:t xml:space="preserve"> Assembly” document)</w:t>
       </w:r>
     </w:p>
     <w:p>
@@ -1567,8 +1703,29 @@
         </w:pBdr>
         <w:spacing w:after="0"/>
       </w:pPr>
-      <w:r>
-        <w:t>right_motor  = Motor(forward=17, backward=18)</w:t>
+      <w:proofErr w:type="spellStart"/>
+      <w:r>
+        <w:t>right_</w:t>
+      </w:r>
+      <w:proofErr w:type="gramStart"/>
+      <w:r>
+        <w:t>motor</w:t>
+      </w:r>
+      <w:proofErr w:type="spellEnd"/>
+      <w:r>
+        <w:t xml:space="preserve">  =</w:t>
+      </w:r>
+      <w:proofErr w:type="gramEnd"/>
+      <w:r>
+        <w:t xml:space="preserve"> </w:t>
+      </w:r>
+      <w:proofErr w:type="gramStart"/>
+      <w:r>
+        <w:t>Motor(</w:t>
+      </w:r>
+      <w:proofErr w:type="gramEnd"/>
+      <w:r>
+        <w:t>forward=17, backward=18)</w:t>
       </w:r>
     </w:p>
     <w:p>
@@ -1586,8 +1743,21 @@
         </w:pBdr>
         <w:spacing w:after="0"/>
       </w:pPr>
-      <w:r>
-        <w:t>left_motor = Motor(forward=22, backward=23)</w:t>
+      <w:proofErr w:type="spellStart"/>
+      <w:r>
+        <w:t>left_motor</w:t>
+      </w:r>
+      <w:proofErr w:type="spellEnd"/>
+      <w:r>
+        <w:t xml:space="preserve"> = </w:t>
+      </w:r>
+      <w:proofErr w:type="gramStart"/>
+      <w:r>
+        <w:t>Motor(</w:t>
+      </w:r>
+      <w:proofErr w:type="gramEnd"/>
+      <w:r>
+        <w:t>forward=22, backward=23)</w:t>
       </w:r>
     </w:p>
     <w:p>
@@ -1697,7 +1867,21 @@
         <w:rPr>
           <w:color w:val="000000"/>
         </w:rPr>
-        <w:t>Ensure that soccerbot works</w:t>
+        <w:t xml:space="preserve">Ensure that </w:t>
+      </w:r>
+      <w:proofErr w:type="spellStart"/>
+      <w:r>
+        <w:rPr>
+          <w:color w:val="000000"/>
+        </w:rPr>
+        <w:t>soccerbot</w:t>
+      </w:r>
+      <w:proofErr w:type="spellEnd"/>
+      <w:r>
+        <w:rPr>
+          <w:color w:val="000000"/>
+        </w:rPr>
+        <w:t xml:space="preserve"> works</w:t>
       </w:r>
     </w:p>
     <w:p>
@@ -1719,7 +1903,21 @@
         <w:rPr>
           <w:color w:val="000000"/>
         </w:rPr>
-        <w:t>Ensure soccerbot travels straight after it centers the ball in its camera</w:t>
+        <w:t xml:space="preserve">Ensure </w:t>
+      </w:r>
+      <w:proofErr w:type="spellStart"/>
+      <w:r>
+        <w:rPr>
+          <w:color w:val="000000"/>
+        </w:rPr>
+        <w:t>soccerbot</w:t>
+      </w:r>
+      <w:proofErr w:type="spellEnd"/>
+      <w:r>
+        <w:rPr>
+          <w:color w:val="000000"/>
+        </w:rPr>
+        <w:t xml:space="preserve"> travels straight after it centers the ball in its camera</w:t>
       </w:r>
     </w:p>
     <w:p>
@@ -1763,7 +1961,21 @@
         <w:rPr>
           <w:color w:val="000000"/>
         </w:rPr>
-        <w:t>`sudo nano soccer_bot.py`</w:t>
+        <w:t>`</w:t>
+      </w:r>
+      <w:proofErr w:type="spellStart"/>
+      <w:r>
+        <w:rPr>
+          <w:color w:val="000000"/>
+        </w:rPr>
+        <w:t>sudo</w:t>
+      </w:r>
+      <w:proofErr w:type="spellEnd"/>
+      <w:r>
+        <w:rPr>
+          <w:color w:val="000000"/>
+        </w:rPr>
+        <w:t xml:space="preserve"> nano soccer_bot.py`</w:t>
       </w:r>
     </w:p>
     <w:p>
@@ -1785,7 +1997,35 @@
         <w:rPr>
           <w:color w:val="000000"/>
         </w:rPr>
-        <w:t>`sudo thonny soccer_bot.py`</w:t>
+        <w:t>`</w:t>
+      </w:r>
+      <w:proofErr w:type="spellStart"/>
+      <w:r>
+        <w:rPr>
+          <w:color w:val="000000"/>
+        </w:rPr>
+        <w:t>sudo</w:t>
+      </w:r>
+      <w:proofErr w:type="spellEnd"/>
+      <w:r>
+        <w:rPr>
+          <w:color w:val="000000"/>
+        </w:rPr>
+        <w:t xml:space="preserve"> </w:t>
+      </w:r>
+      <w:proofErr w:type="spellStart"/>
+      <w:r>
+        <w:rPr>
+          <w:color w:val="000000"/>
+        </w:rPr>
+        <w:t>thonny</w:t>
+      </w:r>
+      <w:proofErr w:type="spellEnd"/>
+      <w:r>
+        <w:rPr>
+          <w:color w:val="000000"/>
+        </w:rPr>
+        <w:t xml:space="preserve"> soccer_bot.py`</w:t>
       </w:r>
     </w:p>
     <w:p>

</xml_diff>